<commit_message>
feat(lessons): add audio across lesson content
</commit_message>
<xml_diff>
--- a/docs/test-guides/E4S_Huong_dan_du_lieu_mau.docx
+++ b/docs/test-guides/E4S_Huong_dan_du_lieu_mau.docx
@@ -2936,6 +2936,497 @@
         <w:pStyle w:val="Heading1"/>
       </w:pPr>
       <w:r>
+        <w:t>Dữ liệu kiểm thử bài học thủ công và âm thanh</w:t>
+      </w:r>
+    </w:p>
+    <w:p>
+      <w:r>
+        <w:t>Dùng tài khoản Operator Phan Minh Châu để soạn hoặc sửa một bài trong bộ B1, sau đó dùng tài khoản Võ Thành Nam để kiểm tra bản đã xuất bản. File audio là dữ liệu tùy chọn; nội dung chữ đã nhập là nguồn dự phòng để trình duyệt đọc bằng Text-to-Speech và không cần dịch vụ AI.</w:t>
+      </w:r>
+    </w:p>
+    <w:tbl>
+      <w:tblPr>
+        <w:tblW w:type="auto" w:w="0"/>
+        <w:jc w:val="center"/>
+        <w:tblLayout w:type="fixed"/>
+        <w:tblLook w:firstColumn="1" w:firstRow="1" w:lastColumn="0" w:lastRow="0" w:noHBand="0" w:noVBand="1" w:val="04A0"/>
+      </w:tblPr>
+      <w:tblGrid>
+        <w:gridCol w:w="3249"/>
+        <w:gridCol w:w="3249"/>
+        <w:gridCol w:w="3249"/>
+      </w:tblGrid>
+      <w:tr>
+        <w:trPr>
+          <w:tblHeader/>
+        </w:trPr>
+        <w:tc>
+          <w:tcPr>
+            <w:tcW w:type="dxa" w:w="1701"/>
+            <w:shd w:fill="1F4E78"/>
+            <w:tcMar>
+              <w:top w:w="100" w:type="dxa"/>
+              <w:start w:w="120" w:type="dxa"/>
+              <w:bottom w:w="100" w:type="dxa"/>
+              <w:end w:w="120" w:type="dxa"/>
+            </w:tcMar>
+            <w:tcBorders>
+              <w:top w:val="single" w:sz="6" w:color="D9D9D9"/>
+              <w:left w:val="single" w:sz="6" w:color="D9D9D9"/>
+              <w:bottom w:val="single" w:sz="6" w:color="D9D9D9"/>
+              <w:right w:val="single" w:sz="6" w:color="D9D9D9"/>
+              <w:insideH w:val="single" w:sz="6" w:color="D9D9D9"/>
+              <w:insideV w:val="single" w:sz="6" w:color="D9D9D9"/>
+            </w:tcBorders>
+            <w:vAlign w:val="center"/>
+          </w:tcPr>
+          <w:p>
+            <w:pPr>
+              <w:jc w:val="center"/>
+            </w:pPr>
+            <w:r>
+              <w:rPr>
+                <w:b/>
+                <w:color w:val="FFFFFF"/>
+              </w:rPr>
+              <w:t>Phần</w:t>
+            </w:r>
+          </w:p>
+        </w:tc>
+        <w:tc>
+          <w:tcPr>
+            <w:tcW w:type="dxa" w:w="3969"/>
+            <w:shd w:fill="1F4E78"/>
+            <w:tcMar>
+              <w:top w:w="100" w:type="dxa"/>
+              <w:start w:w="120" w:type="dxa"/>
+              <w:bottom w:w="100" w:type="dxa"/>
+              <w:end w:w="120" w:type="dxa"/>
+            </w:tcMar>
+            <w:tcBorders>
+              <w:top w:val="single" w:sz="6" w:color="D9D9D9"/>
+              <w:left w:val="single" w:sz="6" w:color="D9D9D9"/>
+              <w:bottom w:val="single" w:sz="6" w:color="D9D9D9"/>
+              <w:right w:val="single" w:sz="6" w:color="D9D9D9"/>
+              <w:insideH w:val="single" w:sz="6" w:color="D9D9D9"/>
+              <w:insideV w:val="single" w:sz="6" w:color="D9D9D9"/>
+            </w:tcBorders>
+            <w:vAlign w:val="center"/>
+          </w:tcPr>
+          <w:p>
+            <w:pPr>
+              <w:jc w:val="center"/>
+            </w:pPr>
+            <w:r>
+              <w:rPr>
+                <w:b/>
+                <w:color w:val="FFFFFF"/>
+              </w:rPr>
+              <w:t>Dữ liệu Operator chuẩn bị</w:t>
+            </w:r>
+          </w:p>
+        </w:tc>
+        <w:tc>
+          <w:tcPr>
+            <w:tcW w:type="dxa" w:w="4365"/>
+            <w:shd w:fill="1F4E78"/>
+            <w:tcMar>
+              <w:top w:w="100" w:type="dxa"/>
+              <w:start w:w="120" w:type="dxa"/>
+              <w:bottom w:w="100" w:type="dxa"/>
+              <w:end w:w="120" w:type="dxa"/>
+            </w:tcMar>
+            <w:tcBorders>
+              <w:top w:val="single" w:sz="6" w:color="D9D9D9"/>
+              <w:left w:val="single" w:sz="6" w:color="D9D9D9"/>
+              <w:bottom w:val="single" w:sz="6" w:color="D9D9D9"/>
+              <w:right w:val="single" w:sz="6" w:color="D9D9D9"/>
+              <w:insideH w:val="single" w:sz="6" w:color="D9D9D9"/>
+              <w:insideV w:val="single" w:sz="6" w:color="D9D9D9"/>
+            </w:tcBorders>
+            <w:vAlign w:val="center"/>
+          </w:tcPr>
+          <w:p>
+            <w:pPr>
+              <w:jc w:val="center"/>
+            </w:pPr>
+            <w:r>
+              <w:rPr>
+                <w:b/>
+                <w:color w:val="FFFFFF"/>
+              </w:rPr>
+              <w:t>Kết quả người học</w:t>
+            </w:r>
+          </w:p>
+        </w:tc>
+      </w:tr>
+      <w:tr>
+        <w:tc>
+          <w:tcPr>
+            <w:tcW w:type="dxa" w:w="1701"/>
+            <w:tcMar>
+              <w:top w:w="100" w:type="dxa"/>
+              <w:start w:w="120" w:type="dxa"/>
+              <w:bottom w:w="100" w:type="dxa"/>
+              <w:end w:w="120" w:type="dxa"/>
+            </w:tcMar>
+            <w:tcBorders>
+              <w:top w:val="single" w:sz="6" w:color="D9D9D9"/>
+              <w:left w:val="single" w:sz="6" w:color="D9D9D9"/>
+              <w:bottom w:val="single" w:sz="6" w:color="D9D9D9"/>
+              <w:right w:val="single" w:sz="6" w:color="D9D9D9"/>
+              <w:insideH w:val="single" w:sz="6" w:color="D9D9D9"/>
+              <w:insideV w:val="single" w:sz="6" w:color="D9D9D9"/>
+            </w:tcBorders>
+            <w:vAlign w:val="center"/>
+          </w:tcPr>
+          <w:p>
+            <w:r>
+              <w:t>Mục tiêu và Hướng dẫn</w:t>
+            </w:r>
+          </w:p>
+        </w:tc>
+        <w:tc>
+          <w:tcPr>
+            <w:tcW w:type="dxa" w:w="3969"/>
+            <w:tcMar>
+              <w:top w:w="100" w:type="dxa"/>
+              <w:start w:w="120" w:type="dxa"/>
+              <w:bottom w:w="100" w:type="dxa"/>
+              <w:end w:w="120" w:type="dxa"/>
+            </w:tcMar>
+            <w:tcBorders>
+              <w:top w:val="single" w:sz="6" w:color="D9D9D9"/>
+              <w:left w:val="single" w:sz="6" w:color="D9D9D9"/>
+              <w:bottom w:val="single" w:sz="6" w:color="D9D9D9"/>
+              <w:right w:val="single" w:sz="6" w:color="D9D9D9"/>
+              <w:insideH w:val="single" w:sz="6" w:color="D9D9D9"/>
+              <w:insideV w:val="single" w:sz="6" w:color="D9D9D9"/>
+            </w:tcBorders>
+            <w:vAlign w:val="center"/>
+          </w:tcPr>
+          <w:p>
+            <w:r>
+              <w:t>Nhập nội dung chữ; có thể tải audio riêng</w:t>
+            </w:r>
+          </w:p>
+        </w:tc>
+        <w:tc>
+          <w:tcPr>
+            <w:tcW w:type="dxa" w:w="4365"/>
+            <w:tcMar>
+              <w:top w:w="100" w:type="dxa"/>
+              <w:start w:w="120" w:type="dxa"/>
+              <w:bottom w:w="100" w:type="dxa"/>
+              <w:end w:w="120" w:type="dxa"/>
+            </w:tcMar>
+            <w:tcBorders>
+              <w:top w:val="single" w:sz="6" w:color="D9D9D9"/>
+              <w:left w:val="single" w:sz="6" w:color="D9D9D9"/>
+              <w:bottom w:val="single" w:sz="6" w:color="D9D9D9"/>
+              <w:right w:val="single" w:sz="6" w:color="D9D9D9"/>
+              <w:insideH w:val="single" w:sz="6" w:color="D9D9D9"/>
+              <w:insideV w:val="single" w:sz="6" w:color="D9D9D9"/>
+            </w:tcBorders>
+            <w:vAlign w:val="center"/>
+          </w:tcPr>
+          <w:p>
+            <w:r>
+              <w:t>Có nút nghe; ưu tiên file đã tải, nếu trống thì đọc nội dung bằng TTS</w:t>
+            </w:r>
+          </w:p>
+        </w:tc>
+      </w:tr>
+      <w:tr>
+        <w:tc>
+          <w:tcPr>
+            <w:tcW w:type="dxa" w:w="1701"/>
+            <w:shd w:fill="F3F7FB"/>
+            <w:tcMar>
+              <w:top w:w="100" w:type="dxa"/>
+              <w:start w:w="120" w:type="dxa"/>
+              <w:bottom w:w="100" w:type="dxa"/>
+              <w:end w:w="120" w:type="dxa"/>
+            </w:tcMar>
+            <w:tcBorders>
+              <w:top w:val="single" w:sz="6" w:color="D9D9D9"/>
+              <w:left w:val="single" w:sz="6" w:color="D9D9D9"/>
+              <w:bottom w:val="single" w:sz="6" w:color="D9D9D9"/>
+              <w:right w:val="single" w:sz="6" w:color="D9D9D9"/>
+              <w:insideH w:val="single" w:sz="6" w:color="D9D9D9"/>
+              <w:insideV w:val="single" w:sz="6" w:color="D9D9D9"/>
+            </w:tcBorders>
+            <w:vAlign w:val="center"/>
+          </w:tcPr>
+          <w:p>
+            <w:r>
+              <w:t>Từ vựng</w:t>
+            </w:r>
+          </w:p>
+        </w:tc>
+        <w:tc>
+          <w:tcPr>
+            <w:tcW w:type="dxa" w:w="3969"/>
+            <w:shd w:fill="F3F7FB"/>
+            <w:tcMar>
+              <w:top w:w="100" w:type="dxa"/>
+              <w:start w:w="120" w:type="dxa"/>
+              <w:bottom w:w="100" w:type="dxa"/>
+              <w:end w:w="120" w:type="dxa"/>
+            </w:tcMar>
+            <w:tcBorders>
+              <w:top w:val="single" w:sz="6" w:color="D9D9D9"/>
+              <w:left w:val="single" w:sz="6" w:color="D9D9D9"/>
+              <w:bottom w:val="single" w:sz="6" w:color="D9D9D9"/>
+              <w:right w:val="single" w:sz="6" w:color="D9D9D9"/>
+              <w:insideH w:val="single" w:sz="6" w:color="D9D9D9"/>
+              <w:insideV w:val="single" w:sz="6" w:color="D9D9D9"/>
+            </w:tcBorders>
+            <w:vAlign w:val="center"/>
+          </w:tcPr>
+          <w:p>
+            <w:r>
+              <w:t>Nhập từ, nghĩa, phiên âm, 3 cụm; ảnh và audio từng từ là tùy chọn</w:t>
+            </w:r>
+          </w:p>
+        </w:tc>
+        <w:tc>
+          <w:tcPr>
+            <w:tcW w:type="dxa" w:w="4365"/>
+            <w:shd w:fill="F3F7FB"/>
+            <w:tcMar>
+              <w:top w:w="100" w:type="dxa"/>
+              <w:start w:w="120" w:type="dxa"/>
+              <w:bottom w:w="100" w:type="dxa"/>
+              <w:end w:w="120" w:type="dxa"/>
+            </w:tcMar>
+            <w:tcBorders>
+              <w:top w:val="single" w:sz="6" w:color="D9D9D9"/>
+              <w:left w:val="single" w:sz="6" w:color="D9D9D9"/>
+              <w:bottom w:val="single" w:sz="6" w:color="D9D9D9"/>
+              <w:right w:val="single" w:sz="6" w:color="D9D9D9"/>
+              <w:insideH w:val="single" w:sz="6" w:color="D9D9D9"/>
+              <w:insideV w:val="single" w:sz="6" w:color="D9D9D9"/>
+            </w:tcBorders>
+            <w:vAlign w:val="center"/>
+          </w:tcPr>
+          <w:p>
+            <w:r>
+              <w:t>Không có ảnh thì thẻ vẫn gọn; không có audio thì đọc từ bằng TTS</w:t>
+            </w:r>
+          </w:p>
+        </w:tc>
+      </w:tr>
+      <w:tr>
+        <w:tc>
+          <w:tcPr>
+            <w:tcW w:type="dxa" w:w="1701"/>
+            <w:tcMar>
+              <w:top w:w="100" w:type="dxa"/>
+              <w:start w:w="120" w:type="dxa"/>
+              <w:bottom w:w="100" w:type="dxa"/>
+              <w:end w:w="120" w:type="dxa"/>
+            </w:tcMar>
+            <w:tcBorders>
+              <w:top w:val="single" w:sz="6" w:color="D9D9D9"/>
+              <w:left w:val="single" w:sz="6" w:color="D9D9D9"/>
+              <w:bottom w:val="single" w:sz="6" w:color="D9D9D9"/>
+              <w:right w:val="single" w:sz="6" w:color="D9D9D9"/>
+              <w:insideH w:val="single" w:sz="6" w:color="D9D9D9"/>
+              <w:insideV w:val="single" w:sz="6" w:color="D9D9D9"/>
+            </w:tcBorders>
+            <w:vAlign w:val="center"/>
+          </w:tcPr>
+          <w:p>
+            <w:r>
+              <w:t>Ngữ pháp và Phát âm</w:t>
+            </w:r>
+          </w:p>
+        </w:tc>
+        <w:tc>
+          <w:tcPr>
+            <w:tcW w:type="dxa" w:w="3969"/>
+            <w:tcMar>
+              <w:top w:w="100" w:type="dxa"/>
+              <w:start w:w="120" w:type="dxa"/>
+              <w:bottom w:w="100" w:type="dxa"/>
+              <w:end w:w="120" w:type="dxa"/>
+            </w:tcMar>
+            <w:tcBorders>
+              <w:top w:val="single" w:sz="6" w:color="D9D9D9"/>
+              <w:left w:val="single" w:sz="6" w:color="D9D9D9"/>
+              <w:bottom w:val="single" w:sz="6" w:color="D9D9D9"/>
+              <w:right w:val="single" w:sz="6" w:color="D9D9D9"/>
+              <w:insideH w:val="single" w:sz="6" w:color="D9D9D9"/>
+              <w:insideV w:val="single" w:sz="6" w:color="D9D9D9"/>
+            </w:tcBorders>
+            <w:vAlign w:val="center"/>
+          </w:tcPr>
+          <w:p>
+            <w:r>
+              <w:t>Nhập công thức, cách dùng, ví dụ, âm mục tiêu và 3 từ luyện; có thể tải audio</w:t>
+            </w:r>
+          </w:p>
+        </w:tc>
+        <w:tc>
+          <w:tcPr>
+            <w:tcW w:type="dxa" w:w="4365"/>
+            <w:tcMar>
+              <w:top w:w="100" w:type="dxa"/>
+              <w:start w:w="120" w:type="dxa"/>
+              <w:bottom w:w="100" w:type="dxa"/>
+              <w:end w:w="120" w:type="dxa"/>
+            </w:tcMar>
+            <w:tcBorders>
+              <w:top w:val="single" w:sz="6" w:color="D9D9D9"/>
+              <w:left w:val="single" w:sz="6" w:color="D9D9D9"/>
+              <w:bottom w:val="single" w:sz="6" w:color="D9D9D9"/>
+              <w:right w:val="single" w:sz="6" w:color="D9D9D9"/>
+              <w:insideH w:val="single" w:sz="6" w:color="D9D9D9"/>
+              <w:insideV w:val="single" w:sz="6" w:color="D9D9D9"/>
+            </w:tcBorders>
+            <w:vAlign w:val="center"/>
+          </w:tcPr>
+          <w:p>
+            <w:r>
+              <w:t>Nghe được nội dung hoặc từng ví dụ; không có file thì dùng TTS</w:t>
+            </w:r>
+          </w:p>
+        </w:tc>
+      </w:tr>
+      <w:tr>
+        <w:tc>
+          <w:tcPr>
+            <w:tcW w:type="dxa" w:w="1701"/>
+            <w:shd w:fill="F3F7FB"/>
+            <w:tcMar>
+              <w:top w:w="100" w:type="dxa"/>
+              <w:start w:w="120" w:type="dxa"/>
+              <w:bottom w:w="100" w:type="dxa"/>
+              <w:end w:w="120" w:type="dxa"/>
+            </w:tcMar>
+            <w:tcBorders>
+              <w:top w:val="single" w:sz="6" w:color="D9D9D9"/>
+              <w:left w:val="single" w:sz="6" w:color="D9D9D9"/>
+              <w:bottom w:val="single" w:sz="6" w:color="D9D9D9"/>
+              <w:right w:val="single" w:sz="6" w:color="D9D9D9"/>
+              <w:insideH w:val="single" w:sz="6" w:color="D9D9D9"/>
+              <w:insideV w:val="single" w:sz="6" w:color="D9D9D9"/>
+            </w:tcBorders>
+            <w:vAlign w:val="center"/>
+          </w:tcPr>
+          <w:p>
+            <w:r>
+              <w:t>Nghe Đọc Viết Từ loại Dùng từ Nói</w:t>
+            </w:r>
+          </w:p>
+        </w:tc>
+        <w:tc>
+          <w:tcPr>
+            <w:tcW w:type="dxa" w:w="3969"/>
+            <w:shd w:fill="F3F7FB"/>
+            <w:tcMar>
+              <w:top w:w="100" w:type="dxa"/>
+              <w:start w:w="120" w:type="dxa"/>
+              <w:bottom w:w="100" w:type="dxa"/>
+              <w:end w:w="120" w:type="dxa"/>
+            </w:tcMar>
+            <w:tcBorders>
+              <w:top w:val="single" w:sz="6" w:color="D9D9D9"/>
+              <w:left w:val="single" w:sz="6" w:color="D9D9D9"/>
+              <w:bottom w:val="single" w:sz="6" w:color="D9D9D9"/>
+              <w:right w:val="single" w:sz="6" w:color="D9D9D9"/>
+              <w:insideH w:val="single" w:sz="6" w:color="D9D9D9"/>
+              <w:insideV w:val="single" w:sz="6" w:color="D9D9D9"/>
+            </w:tcBorders>
+            <w:vAlign w:val="center"/>
+          </w:tcPr>
+          <w:p>
+            <w:r>
+              <w:t>Nhập đủ nội dung, câu hỏi và đáp án; có thể tải audio cho từng phần</w:t>
+            </w:r>
+          </w:p>
+        </w:tc>
+        <w:tc>
+          <w:tcPr>
+            <w:tcW w:type="dxa" w:w="4365"/>
+            <w:shd w:fill="F3F7FB"/>
+            <w:tcMar>
+              <w:top w:w="100" w:type="dxa"/>
+              <w:start w:w="120" w:type="dxa"/>
+              <w:bottom w:w="100" w:type="dxa"/>
+              <w:end w:w="120" w:type="dxa"/>
+            </w:tcMar>
+            <w:tcBorders>
+              <w:top w:val="single" w:sz="6" w:color="D9D9D9"/>
+              <w:left w:val="single" w:sz="6" w:color="D9D9D9"/>
+              <w:bottom w:val="single" w:sz="6" w:color="D9D9D9"/>
+              <w:right w:val="single" w:sz="6" w:color="D9D9D9"/>
+              <w:insideH w:val="single" w:sz="6" w:color="D9D9D9"/>
+              <w:insideV w:val="single" w:sz="6" w:color="D9D9D9"/>
+            </w:tcBorders>
+            <w:vAlign w:val="center"/>
+          </w:tcPr>
+          <w:p>
+            <w:r>
+              <w:t>Mỗi phần có audio từ file hoặc TTS; Nói vẫn cho ghi âm hoặc tải file để nộp</w:t>
+            </w:r>
+          </w:p>
+        </w:tc>
+      </w:tr>
+    </w:tbl>
+    <w:p>
+      <w:pPr>
+        <w:spacing w:after="40"/>
+      </w:pPr>
+    </w:p>
+    <w:p>
+      <w:pPr>
+        <w:ind w:left="142"/>
+      </w:pPr>
+      <w:r>
+        <w:rPr>
+          <w:b/>
+        </w:rPr>
+        <w:t xml:space="preserve">☐ </w:t>
+      </w:r>
+      <w:r>
+        <w:t>Tải lại trang không làm mất URL audio đã lưu.</w:t>
+      </w:r>
+    </w:p>
+    <w:p>
+      <w:pPr>
+        <w:ind w:left="142"/>
+      </w:pPr>
+      <w:r>
+        <w:rPr>
+          <w:b/>
+        </w:rPr>
+        <w:t xml:space="preserve">☐ </w:t>
+      </w:r>
+      <w:r>
+        <w:t>Để trống file audio không chặn lưu, duyệt, xuất bản hoặc học bài.</w:t>
+      </w:r>
+    </w:p>
+    <w:p>
+      <w:pPr>
+        <w:ind w:left="142"/>
+      </w:pPr>
+      <w:r>
+        <w:rPr>
+          <w:b/>
+        </w:rPr>
+        <w:t xml:space="preserve">☐ </w:t>
+      </w:r>
+      <w:r>
+        <w:t>Tắt AI vẫn nghe được các phần có nội dung chữ bằng Text-to-Speech của trình duyệt.</w:t>
+      </w:r>
+    </w:p>
+    <w:p>
+      <w:pPr>
+        <w:pStyle w:val="Heading1"/>
+      </w:pPr>
+      <w:r>
         <w:t>Khôi phục dữ liệu</w:t>
       </w:r>
     </w:p>

</xml_diff>